<commit_message>
docs: finalize project report and UML diagrams
</commit_message>
<xml_diff>
--- a/docs/Звіт_Проєкт_DigiUni_Registry.docx
+++ b/docs/Звіт_Проєкт_DigiUni_Registry.docx
@@ -964,7 +964,7 @@
     </w:p>
     <w:p>
       <w:pPr>
-        <w:pStyle w:val="a9"/>
+        <w:pStyle w:val="ListParagraph"/>
         <w:tabs>
           <w:tab w:val="left" w:pos="560"/>
           <w:tab w:val="left" w:pos="1120"/>
@@ -993,7 +993,7 @@
     </w:p>
     <w:p>
       <w:pPr>
-        <w:pStyle w:val="a9"/>
+        <w:pStyle w:val="ListParagraph"/>
         <w:numPr>
           <w:ilvl w:val="0"/>
           <w:numId w:val="1"/>
@@ -1034,7 +1034,7 @@
     </w:p>
     <w:p>
       <w:pPr>
-        <w:pStyle w:val="a9"/>
+        <w:pStyle w:val="ListParagraph"/>
         <w:numPr>
           <w:ilvl w:val="0"/>
           <w:numId w:val="1"/>
@@ -1075,7 +1075,7 @@
     </w:p>
     <w:p>
       <w:pPr>
-        <w:pStyle w:val="a9"/>
+        <w:pStyle w:val="ListParagraph"/>
         <w:numPr>
           <w:ilvl w:val="0"/>
           <w:numId w:val="1"/>
@@ -1116,7 +1116,7 @@
     </w:p>
     <w:p>
       <w:pPr>
-        <w:pStyle w:val="a9"/>
+        <w:pStyle w:val="ListParagraph"/>
         <w:numPr>
           <w:ilvl w:val="0"/>
           <w:numId w:val="1"/>
@@ -1166,7 +1166,7 @@
     </w:p>
     <w:p>
       <w:pPr>
-        <w:pStyle w:val="a9"/>
+        <w:pStyle w:val="ListParagraph"/>
         <w:numPr>
           <w:ilvl w:val="0"/>
           <w:numId w:val="1"/>
@@ -1207,7 +1207,7 @@
     </w:p>
     <w:p>
       <w:pPr>
-        <w:pStyle w:val="a9"/>
+        <w:pStyle w:val="ListParagraph"/>
         <w:numPr>
           <w:ilvl w:val="0"/>
           <w:numId w:val="1"/>
@@ -1248,7 +1248,7 @@
     </w:p>
     <w:p>
       <w:pPr>
-        <w:pStyle w:val="a9"/>
+        <w:pStyle w:val="ListParagraph"/>
         <w:numPr>
           <w:ilvl w:val="0"/>
           <w:numId w:val="1"/>
@@ -1335,7 +1335,7 @@
     </w:p>
     <w:p>
       <w:pPr>
-        <w:pStyle w:val="a9"/>
+        <w:pStyle w:val="ListParagraph"/>
         <w:numPr>
           <w:ilvl w:val="0"/>
           <w:numId w:val="18"/>
@@ -3720,7 +3720,7 @@
     </w:p>
     <w:p>
       <w:pPr>
-        <w:pStyle w:val="a9"/>
+        <w:pStyle w:val="ListParagraph"/>
         <w:numPr>
           <w:ilvl w:val="0"/>
           <w:numId w:val="18"/>
@@ -3748,7 +3748,7 @@
     </w:p>
     <w:p>
       <w:pPr>
-        <w:pStyle w:val="a9"/>
+        <w:pStyle w:val="ListParagraph"/>
         <w:numPr>
           <w:ilvl w:val="0"/>
           <w:numId w:val="14"/>
@@ -3781,7 +3781,7 @@
     </w:p>
     <w:p>
       <w:pPr>
-        <w:pStyle w:val="a9"/>
+        <w:pStyle w:val="ListParagraph"/>
         <w:numPr>
           <w:ilvl w:val="1"/>
           <w:numId w:val="14"/>
@@ -3837,7 +3837,7 @@
     </w:p>
     <w:p>
       <w:pPr>
-        <w:pStyle w:val="a9"/>
+        <w:pStyle w:val="ListParagraph"/>
         <w:numPr>
           <w:ilvl w:val="1"/>
           <w:numId w:val="14"/>
@@ -3901,7 +3901,7 @@
     </w:p>
     <w:p>
       <w:pPr>
-        <w:pStyle w:val="a9"/>
+        <w:pStyle w:val="ListParagraph"/>
         <w:numPr>
           <w:ilvl w:val="2"/>
           <w:numId w:val="14"/>
@@ -3925,7 +3925,7 @@
     </w:p>
     <w:p>
       <w:pPr>
-        <w:pStyle w:val="a9"/>
+        <w:pStyle w:val="ListParagraph"/>
         <w:numPr>
           <w:ilvl w:val="2"/>
           <w:numId w:val="14"/>
@@ -3949,7 +3949,7 @@
     </w:p>
     <w:p>
       <w:pPr>
-        <w:pStyle w:val="a9"/>
+        <w:pStyle w:val="ListParagraph"/>
         <w:numPr>
           <w:ilvl w:val="2"/>
           <w:numId w:val="14"/>
@@ -3975,7 +3975,7 @@
     </w:p>
     <w:p>
       <w:pPr>
-        <w:pStyle w:val="a9"/>
+        <w:pStyle w:val="ListParagraph"/>
         <w:numPr>
           <w:ilvl w:val="1"/>
           <w:numId w:val="14"/>
@@ -4031,7 +4031,7 @@
     </w:p>
     <w:p>
       <w:pPr>
-        <w:pStyle w:val="a9"/>
+        <w:pStyle w:val="ListParagraph"/>
         <w:numPr>
           <w:ilvl w:val="2"/>
           <w:numId w:val="14"/>
@@ -4054,7 +4054,7 @@
     </w:p>
     <w:p>
       <w:pPr>
-        <w:pStyle w:val="a9"/>
+        <w:pStyle w:val="ListParagraph"/>
         <w:numPr>
           <w:ilvl w:val="2"/>
           <w:numId w:val="14"/>
@@ -4077,7 +4077,7 @@
     </w:p>
     <w:p>
       <w:pPr>
-        <w:pStyle w:val="a9"/>
+        <w:pStyle w:val="ListParagraph"/>
         <w:numPr>
           <w:ilvl w:val="1"/>
           <w:numId w:val="14"/>
@@ -4158,7 +4158,7 @@
     </w:p>
     <w:p>
       <w:pPr>
-        <w:pStyle w:val="a9"/>
+        <w:pStyle w:val="ListParagraph"/>
         <w:numPr>
           <w:ilvl w:val="2"/>
           <w:numId w:val="14"/>
@@ -4181,7 +4181,7 @@
     </w:p>
     <w:p>
       <w:pPr>
-        <w:pStyle w:val="a9"/>
+        <w:pStyle w:val="ListParagraph"/>
         <w:numPr>
           <w:ilvl w:val="2"/>
           <w:numId w:val="14"/>
@@ -4204,7 +4204,7 @@
     </w:p>
     <w:p>
       <w:pPr>
-        <w:pStyle w:val="a9"/>
+        <w:pStyle w:val="ListParagraph"/>
         <w:numPr>
           <w:ilvl w:val="1"/>
           <w:numId w:val="14"/>
@@ -4237,7 +4237,7 @@
     </w:p>
     <w:p>
       <w:pPr>
-        <w:pStyle w:val="a9"/>
+        <w:pStyle w:val="ListParagraph"/>
         <w:numPr>
           <w:ilvl w:val="2"/>
           <w:numId w:val="14"/>
@@ -4269,7 +4269,7 @@
     </w:p>
     <w:p>
       <w:pPr>
-        <w:pStyle w:val="a9"/>
+        <w:pStyle w:val="ListParagraph"/>
         <w:numPr>
           <w:ilvl w:val="3"/>
           <w:numId w:val="14"/>
@@ -4416,7 +4416,7 @@
     </w:p>
     <w:p>
       <w:pPr>
-        <w:pStyle w:val="a9"/>
+        <w:pStyle w:val="ListParagraph"/>
         <w:numPr>
           <w:ilvl w:val="3"/>
           <w:numId w:val="14"/>
@@ -4545,7 +4545,7 @@
     </w:p>
     <w:p>
       <w:pPr>
-        <w:pStyle w:val="a9"/>
+        <w:pStyle w:val="ListParagraph"/>
         <w:numPr>
           <w:ilvl w:val="2"/>
           <w:numId w:val="14"/>
@@ -4614,7 +4614,7 @@
     </w:p>
     <w:p>
       <w:pPr>
-        <w:pStyle w:val="a9"/>
+        <w:pStyle w:val="ListParagraph"/>
         <w:numPr>
           <w:ilvl w:val="1"/>
           <w:numId w:val="14"/>
@@ -4839,7 +4839,7 @@
     </w:p>
     <w:p>
       <w:pPr>
-        <w:pStyle w:val="a9"/>
+        <w:pStyle w:val="ListParagraph"/>
         <w:numPr>
           <w:ilvl w:val="1"/>
           <w:numId w:val="14"/>
@@ -4887,7 +4887,7 @@
     </w:p>
     <w:p>
       <w:pPr>
-        <w:pStyle w:val="a9"/>
+        <w:pStyle w:val="ListParagraph"/>
         <w:numPr>
           <w:ilvl w:val="2"/>
           <w:numId w:val="14"/>
@@ -4922,7 +4922,7 @@
     </w:p>
     <w:p>
       <w:pPr>
-        <w:pStyle w:val="a9"/>
+        <w:pStyle w:val="ListParagraph"/>
         <w:numPr>
           <w:ilvl w:val="2"/>
           <w:numId w:val="14"/>
@@ -4957,7 +4957,7 @@
     </w:p>
     <w:p>
       <w:pPr>
-        <w:pStyle w:val="a9"/>
+        <w:pStyle w:val="ListParagraph"/>
         <w:numPr>
           <w:ilvl w:val="2"/>
           <w:numId w:val="14"/>
@@ -4992,7 +4992,7 @@
     </w:p>
     <w:p>
       <w:pPr>
-        <w:pStyle w:val="a9"/>
+        <w:pStyle w:val="ListParagraph"/>
         <w:numPr>
           <w:ilvl w:val="2"/>
           <w:numId w:val="14"/>
@@ -5027,7 +5027,7 @@
     </w:p>
     <w:p>
       <w:pPr>
-        <w:pStyle w:val="a9"/>
+        <w:pStyle w:val="ListParagraph"/>
         <w:numPr>
           <w:ilvl w:val="2"/>
           <w:numId w:val="14"/>
@@ -5062,7 +5062,7 @@
     </w:p>
     <w:p>
       <w:pPr>
-        <w:pStyle w:val="a9"/>
+        <w:pStyle w:val="ListParagraph"/>
         <w:numPr>
           <w:ilvl w:val="2"/>
           <w:numId w:val="14"/>
@@ -5097,7 +5097,7 @@
     </w:p>
     <w:p>
       <w:pPr>
-        <w:pStyle w:val="a9"/>
+        <w:pStyle w:val="ListParagraph"/>
         <w:numPr>
           <w:ilvl w:val="2"/>
           <w:numId w:val="14"/>
@@ -5134,7 +5134,7 @@
     </w:p>
     <w:p>
       <w:pPr>
-        <w:pStyle w:val="a9"/>
+        <w:pStyle w:val="ListParagraph"/>
         <w:numPr>
           <w:ilvl w:val="1"/>
           <w:numId w:val="14"/>
@@ -5174,7 +5174,7 @@
     </w:p>
     <w:p>
       <w:pPr>
-        <w:pStyle w:val="a9"/>
+        <w:pStyle w:val="ListParagraph"/>
         <w:numPr>
           <w:ilvl w:val="2"/>
           <w:numId w:val="14"/>
@@ -5222,7 +5222,7 @@
     </w:p>
     <w:p>
       <w:pPr>
-        <w:pStyle w:val="a9"/>
+        <w:pStyle w:val="ListParagraph"/>
         <w:numPr>
           <w:ilvl w:val="2"/>
           <w:numId w:val="14"/>
@@ -5253,7 +5253,7 @@
     </w:p>
     <w:p>
       <w:pPr>
-        <w:pStyle w:val="a9"/>
+        <w:pStyle w:val="ListParagraph"/>
         <w:numPr>
           <w:ilvl w:val="2"/>
           <w:numId w:val="14"/>
@@ -5301,7 +5301,7 @@
     </w:p>
     <w:p>
       <w:pPr>
-        <w:pStyle w:val="a9"/>
+        <w:pStyle w:val="ListParagraph"/>
         <w:numPr>
           <w:ilvl w:val="2"/>
           <w:numId w:val="14"/>
@@ -5340,7 +5340,7 @@
     </w:p>
     <w:p>
       <w:pPr>
-        <w:pStyle w:val="a9"/>
+        <w:pStyle w:val="ListParagraph"/>
         <w:numPr>
           <w:ilvl w:val="1"/>
           <w:numId w:val="14"/>
@@ -5364,7 +5364,7 @@
     </w:p>
     <w:p>
       <w:pPr>
-        <w:pStyle w:val="a9"/>
+        <w:pStyle w:val="ListParagraph"/>
         <w:numPr>
           <w:ilvl w:val="2"/>
           <w:numId w:val="14"/>
@@ -5395,7 +5395,7 @@
     </w:p>
     <w:p>
       <w:pPr>
-        <w:pStyle w:val="a9"/>
+        <w:pStyle w:val="ListParagraph"/>
         <w:numPr>
           <w:ilvl w:val="2"/>
           <w:numId w:val="14"/>
@@ -5426,7 +5426,7 @@
     </w:p>
     <w:p>
       <w:pPr>
-        <w:pStyle w:val="a9"/>
+        <w:pStyle w:val="ListParagraph"/>
         <w:numPr>
           <w:ilvl w:val="3"/>
           <w:numId w:val="14"/>
@@ -5449,7 +5449,7 @@
     </w:p>
     <w:p>
       <w:pPr>
-        <w:pStyle w:val="a9"/>
+        <w:pStyle w:val="ListParagraph"/>
         <w:numPr>
           <w:ilvl w:val="3"/>
           <w:numId w:val="14"/>
@@ -5472,7 +5472,7 @@
     </w:p>
     <w:p>
       <w:pPr>
-        <w:pStyle w:val="a9"/>
+        <w:pStyle w:val="ListParagraph"/>
         <w:numPr>
           <w:ilvl w:val="3"/>
           <w:numId w:val="14"/>
@@ -5495,7 +5495,7 @@
     </w:p>
     <w:p>
       <w:pPr>
-        <w:pStyle w:val="a9"/>
+        <w:pStyle w:val="ListParagraph"/>
         <w:numPr>
           <w:ilvl w:val="1"/>
           <w:numId w:val="14"/>
@@ -5670,7 +5670,7 @@
     </w:p>
     <w:p>
       <w:pPr>
-        <w:pStyle w:val="a9"/>
+        <w:pStyle w:val="ListParagraph"/>
         <w:numPr>
           <w:ilvl w:val="1"/>
           <w:numId w:val="14"/>
@@ -5737,7 +5737,7 @@
     </w:p>
     <w:p>
       <w:pPr>
-        <w:pStyle w:val="a9"/>
+        <w:pStyle w:val="ListParagraph"/>
         <w:numPr>
           <w:ilvl w:val="1"/>
           <w:numId w:val="14"/>
@@ -5861,7 +5861,7 @@
     </w:p>
     <w:p>
       <w:pPr>
-        <w:pStyle w:val="a9"/>
+        <w:pStyle w:val="ListParagraph"/>
         <w:numPr>
           <w:ilvl w:val="1"/>
           <w:numId w:val="14"/>
@@ -5884,7 +5884,7 @@
     </w:p>
     <w:p>
       <w:pPr>
-        <w:pStyle w:val="a9"/>
+        <w:pStyle w:val="ListParagraph"/>
         <w:numPr>
           <w:ilvl w:val="2"/>
           <w:numId w:val="14"/>
@@ -5908,7 +5908,7 @@
     </w:p>
     <w:p>
       <w:pPr>
-        <w:pStyle w:val="a9"/>
+        <w:pStyle w:val="ListParagraph"/>
         <w:numPr>
           <w:ilvl w:val="2"/>
           <w:numId w:val="14"/>
@@ -5932,7 +5932,7 @@
     </w:p>
     <w:p>
       <w:pPr>
-        <w:pStyle w:val="a9"/>
+        <w:pStyle w:val="ListParagraph"/>
         <w:numPr>
           <w:ilvl w:val="2"/>
           <w:numId w:val="14"/>
@@ -5956,7 +5956,7 @@
     </w:p>
     <w:p>
       <w:pPr>
-        <w:pStyle w:val="a9"/>
+        <w:pStyle w:val="ListParagraph"/>
         <w:numPr>
           <w:ilvl w:val="2"/>
           <w:numId w:val="14"/>
@@ -5980,7 +5980,7 @@
     </w:p>
     <w:p>
       <w:pPr>
-        <w:pStyle w:val="a9"/>
+        <w:pStyle w:val="ListParagraph"/>
         <w:numPr>
           <w:ilvl w:val="2"/>
           <w:numId w:val="14"/>
@@ -6004,7 +6004,7 @@
     </w:p>
     <w:p>
       <w:pPr>
-        <w:pStyle w:val="a9"/>
+        <w:pStyle w:val="ListParagraph"/>
         <w:numPr>
           <w:ilvl w:val="2"/>
           <w:numId w:val="14"/>
@@ -6028,7 +6028,7 @@
     </w:p>
     <w:p>
       <w:pPr>
-        <w:pStyle w:val="a9"/>
+        <w:pStyle w:val="ListParagraph"/>
         <w:numPr>
           <w:ilvl w:val="2"/>
           <w:numId w:val="14"/>
@@ -6063,7 +6063,7 @@
     </w:p>
     <w:p>
       <w:pPr>
-        <w:pStyle w:val="a9"/>
+        <w:pStyle w:val="ListParagraph"/>
         <w:numPr>
           <w:ilvl w:val="1"/>
           <w:numId w:val="14"/>
@@ -6095,7 +6095,7 @@
     </w:p>
     <w:p>
       <w:pPr>
-        <w:pStyle w:val="a9"/>
+        <w:pStyle w:val="ListParagraph"/>
         <w:numPr>
           <w:ilvl w:val="2"/>
           <w:numId w:val="14"/>
@@ -6118,7 +6118,7 @@
     </w:p>
     <w:p>
       <w:pPr>
-        <w:pStyle w:val="a9"/>
+        <w:pStyle w:val="ListParagraph"/>
         <w:numPr>
           <w:ilvl w:val="2"/>
           <w:numId w:val="14"/>
@@ -6149,7 +6149,7 @@
     </w:p>
     <w:p>
       <w:pPr>
-        <w:pStyle w:val="a9"/>
+        <w:pStyle w:val="ListParagraph"/>
         <w:numPr>
           <w:ilvl w:val="2"/>
           <w:numId w:val="14"/>
@@ -6172,7 +6172,7 @@
     </w:p>
     <w:p>
       <w:pPr>
-        <w:pStyle w:val="a9"/>
+        <w:pStyle w:val="ListParagraph"/>
         <w:numPr>
           <w:ilvl w:val="0"/>
           <w:numId w:val="15"/>
@@ -6205,7 +6205,7 @@
     </w:p>
     <w:p>
       <w:pPr>
-        <w:pStyle w:val="a9"/>
+        <w:pStyle w:val="ListParagraph"/>
         <w:numPr>
           <w:ilvl w:val="1"/>
           <w:numId w:val="14"/>
@@ -6269,7 +6269,7 @@
     </w:p>
     <w:p>
       <w:pPr>
-        <w:pStyle w:val="a9"/>
+        <w:pStyle w:val="ListParagraph"/>
         <w:numPr>
           <w:ilvl w:val="2"/>
           <w:numId w:val="14"/>
@@ -6293,7 +6293,7 @@
     </w:p>
     <w:p>
       <w:pPr>
-        <w:pStyle w:val="a9"/>
+        <w:pStyle w:val="ListParagraph"/>
         <w:numPr>
           <w:ilvl w:val="2"/>
           <w:numId w:val="14"/>
@@ -6317,7 +6317,7 @@
     </w:p>
     <w:p>
       <w:pPr>
-        <w:pStyle w:val="a9"/>
+        <w:pStyle w:val="ListParagraph"/>
         <w:numPr>
           <w:ilvl w:val="2"/>
           <w:numId w:val="14"/>
@@ -6352,7 +6352,7 @@
     </w:p>
     <w:p>
       <w:pPr>
-        <w:pStyle w:val="a9"/>
+        <w:pStyle w:val="ListParagraph"/>
         <w:numPr>
           <w:ilvl w:val="1"/>
           <w:numId w:val="14"/>
@@ -6400,7 +6400,7 @@
     </w:p>
     <w:p>
       <w:pPr>
-        <w:pStyle w:val="a9"/>
+        <w:pStyle w:val="ListParagraph"/>
         <w:numPr>
           <w:ilvl w:val="2"/>
           <w:numId w:val="14"/>
@@ -6423,7 +6423,7 @@
     </w:p>
     <w:p>
       <w:pPr>
-        <w:pStyle w:val="a9"/>
+        <w:pStyle w:val="ListParagraph"/>
         <w:numPr>
           <w:ilvl w:val="2"/>
           <w:numId w:val="14"/>
@@ -6446,7 +6446,7 @@
     </w:p>
     <w:p>
       <w:pPr>
-        <w:pStyle w:val="a9"/>
+        <w:pStyle w:val="ListParagraph"/>
         <w:numPr>
           <w:ilvl w:val="1"/>
           <w:numId w:val="14"/>
@@ -6527,7 +6527,7 @@
     </w:p>
     <w:p>
       <w:pPr>
-        <w:pStyle w:val="a9"/>
+        <w:pStyle w:val="ListParagraph"/>
         <w:numPr>
           <w:ilvl w:val="2"/>
           <w:numId w:val="14"/>
@@ -6550,7 +6550,7 @@
     </w:p>
     <w:p>
       <w:pPr>
-        <w:pStyle w:val="a9"/>
+        <w:pStyle w:val="ListParagraph"/>
         <w:numPr>
           <w:ilvl w:val="2"/>
           <w:numId w:val="14"/>
@@ -6573,7 +6573,7 @@
     </w:p>
     <w:p>
       <w:pPr>
-        <w:pStyle w:val="a9"/>
+        <w:pStyle w:val="ListParagraph"/>
         <w:numPr>
           <w:ilvl w:val="2"/>
           <w:numId w:val="14"/>
@@ -6596,7 +6596,7 @@
     </w:p>
     <w:p>
       <w:pPr>
-        <w:pStyle w:val="a9"/>
+        <w:pStyle w:val="ListParagraph"/>
         <w:numPr>
           <w:ilvl w:val="1"/>
           <w:numId w:val="14"/>
@@ -6637,7 +6637,7 @@
     </w:p>
     <w:p>
       <w:pPr>
-        <w:pStyle w:val="a9"/>
+        <w:pStyle w:val="ListParagraph"/>
         <w:numPr>
           <w:ilvl w:val="2"/>
           <w:numId w:val="14"/>
@@ -6668,7 +6668,7 @@
     </w:p>
     <w:p>
       <w:pPr>
-        <w:pStyle w:val="a9"/>
+        <w:pStyle w:val="ListParagraph"/>
         <w:numPr>
           <w:ilvl w:val="2"/>
           <w:numId w:val="14"/>
@@ -6699,7 +6699,7 @@
     </w:p>
     <w:p>
       <w:pPr>
-        <w:pStyle w:val="a9"/>
+        <w:pStyle w:val="ListParagraph"/>
         <w:numPr>
           <w:ilvl w:val="2"/>
           <w:numId w:val="14"/>
@@ -6730,7 +6730,7 @@
     </w:p>
     <w:p>
       <w:pPr>
-        <w:pStyle w:val="a9"/>
+        <w:pStyle w:val="ListParagraph"/>
         <w:numPr>
           <w:ilvl w:val="1"/>
           <w:numId w:val="14"/>
@@ -6762,7 +6762,7 @@
     </w:p>
     <w:p>
       <w:pPr>
-        <w:pStyle w:val="a9"/>
+        <w:pStyle w:val="ListParagraph"/>
         <w:numPr>
           <w:ilvl w:val="2"/>
           <w:numId w:val="14"/>
@@ -6802,7 +6802,7 @@
     </w:p>
     <w:p>
       <w:pPr>
-        <w:pStyle w:val="a9"/>
+        <w:pStyle w:val="ListParagraph"/>
         <w:numPr>
           <w:ilvl w:val="3"/>
           <w:numId w:val="14"/>
@@ -6873,7 +6873,7 @@
     </w:p>
     <w:p>
       <w:pPr>
-        <w:pStyle w:val="a9"/>
+        <w:pStyle w:val="ListParagraph"/>
         <w:numPr>
           <w:ilvl w:val="3"/>
           <w:numId w:val="14"/>
@@ -7004,7 +7004,7 @@
     </w:p>
     <w:p>
       <w:pPr>
-        <w:pStyle w:val="a9"/>
+        <w:pStyle w:val="ListParagraph"/>
         <w:numPr>
           <w:ilvl w:val="2"/>
           <w:numId w:val="14"/>
@@ -7044,7 +7044,7 @@
     </w:p>
     <w:p>
       <w:pPr>
-        <w:pStyle w:val="a9"/>
+        <w:pStyle w:val="ListParagraph"/>
         <w:numPr>
           <w:ilvl w:val="3"/>
           <w:numId w:val="14"/>
@@ -7115,7 +7115,7 @@
     </w:p>
     <w:p>
       <w:pPr>
-        <w:pStyle w:val="a9"/>
+        <w:pStyle w:val="ListParagraph"/>
         <w:numPr>
           <w:ilvl w:val="3"/>
           <w:numId w:val="14"/>
@@ -7254,7 +7254,7 @@
     </w:p>
     <w:p>
       <w:pPr>
-        <w:pStyle w:val="a9"/>
+        <w:pStyle w:val="ListParagraph"/>
         <w:numPr>
           <w:ilvl w:val="1"/>
           <w:numId w:val="14"/>
@@ -7340,7 +7340,7 @@
     </w:p>
     <w:p>
       <w:pPr>
-        <w:pStyle w:val="a9"/>
+        <w:pStyle w:val="ListParagraph"/>
         <w:numPr>
           <w:ilvl w:val="1"/>
           <w:numId w:val="14"/>
@@ -7427,7 +7427,7 @@
     </w:p>
     <w:p>
       <w:pPr>
-        <w:pStyle w:val="a9"/>
+        <w:pStyle w:val="ListParagraph"/>
         <w:numPr>
           <w:ilvl w:val="1"/>
           <w:numId w:val="14"/>
@@ -7501,7 +7501,7 @@
     </w:p>
     <w:p>
       <w:pPr>
-        <w:pStyle w:val="a9"/>
+        <w:pStyle w:val="ListParagraph"/>
         <w:numPr>
           <w:ilvl w:val="2"/>
           <w:numId w:val="14"/>
@@ -7536,7 +7536,7 @@
     </w:p>
     <w:p>
       <w:pPr>
-        <w:pStyle w:val="a9"/>
+        <w:pStyle w:val="ListParagraph"/>
         <w:numPr>
           <w:ilvl w:val="2"/>
           <w:numId w:val="14"/>
@@ -7560,7 +7560,7 @@
     </w:p>
     <w:p>
       <w:pPr>
-        <w:pStyle w:val="a9"/>
+        <w:pStyle w:val="ListParagraph"/>
         <w:numPr>
           <w:ilvl w:val="2"/>
           <w:numId w:val="14"/>
@@ -7597,7 +7597,7 @@
     </w:p>
     <w:p>
       <w:pPr>
-        <w:pStyle w:val="a9"/>
+        <w:pStyle w:val="ListParagraph"/>
         <w:numPr>
           <w:ilvl w:val="1"/>
           <w:numId w:val="14"/>
@@ -7715,7 +7715,7 @@
     </w:p>
     <w:p>
       <w:pPr>
-        <w:pStyle w:val="a9"/>
+        <w:pStyle w:val="ListParagraph"/>
         <w:numPr>
           <w:ilvl w:val="1"/>
           <w:numId w:val="14"/>
@@ -7738,7 +7738,7 @@
     </w:p>
     <w:p>
       <w:pPr>
-        <w:pStyle w:val="a9"/>
+        <w:pStyle w:val="ListParagraph"/>
         <w:numPr>
           <w:ilvl w:val="2"/>
           <w:numId w:val="14"/>
@@ -7761,7 +7761,7 @@
     </w:p>
     <w:p>
       <w:pPr>
-        <w:pStyle w:val="a9"/>
+        <w:pStyle w:val="ListParagraph"/>
         <w:numPr>
           <w:ilvl w:val="2"/>
           <w:numId w:val="14"/>
@@ -7796,20 +7796,12 @@
           <w:sz w:val="28"/>
           <w:szCs w:val="28"/>
         </w:rPr>
-        <w:t>-діаграми</w:t>
-      </w:r>
-      <w:r>
-        <w:rPr>
-          <w:rFonts w:ascii="Times New Roman" w:hAnsi="Times New Roman" w:cs="Times New Roman"/>
-          <w:sz w:val="28"/>
-          <w:szCs w:val="28"/>
-        </w:rPr>
-        <w:t>,</w:t>
-      </w:r>
-    </w:p>
-    <w:p>
-      <w:pPr>
-        <w:pStyle w:val="a9"/>
+        <w:t>-діаграми,</w:t>
+      </w:r>
+    </w:p>
+    <w:p>
+      <w:pPr>
+        <w:pStyle w:val="ListParagraph"/>
         <w:numPr>
           <w:ilvl w:val="2"/>
           <w:numId w:val="14"/>
@@ -7832,7 +7824,7 @@
     </w:p>
     <w:p>
       <w:pPr>
-        <w:pStyle w:val="a9"/>
+        <w:pStyle w:val="ListParagraph"/>
         <w:numPr>
           <w:ilvl w:val="2"/>
           <w:numId w:val="14"/>
@@ -7855,7 +7847,7 @@
     </w:p>
     <w:p>
       <w:pPr>
-        <w:pStyle w:val="a9"/>
+        <w:pStyle w:val="ListParagraph"/>
         <w:numPr>
           <w:ilvl w:val="0"/>
           <w:numId w:val="15"/>
@@ -7888,7 +7880,7 @@
     </w:p>
     <w:p>
       <w:pPr>
-        <w:pStyle w:val="a9"/>
+        <w:pStyle w:val="ListParagraph"/>
         <w:numPr>
           <w:ilvl w:val="1"/>
           <w:numId w:val="15"/>
@@ -7921,7 +7913,7 @@
     </w:p>
     <w:p>
       <w:pPr>
-        <w:pStyle w:val="a9"/>
+        <w:pStyle w:val="ListParagraph"/>
         <w:numPr>
           <w:ilvl w:val="2"/>
           <w:numId w:val="15"/>
@@ -7944,7 +7936,7 @@
     </w:p>
     <w:p>
       <w:pPr>
-        <w:pStyle w:val="a9"/>
+        <w:pStyle w:val="ListParagraph"/>
         <w:numPr>
           <w:ilvl w:val="2"/>
           <w:numId w:val="15"/>
@@ -7967,7 +7959,7 @@
     </w:p>
     <w:p>
       <w:pPr>
-        <w:pStyle w:val="a9"/>
+        <w:pStyle w:val="ListParagraph"/>
         <w:numPr>
           <w:ilvl w:val="2"/>
           <w:numId w:val="15"/>
@@ -8017,7 +8009,7 @@
     </w:p>
     <w:p>
       <w:pPr>
-        <w:pStyle w:val="a9"/>
+        <w:pStyle w:val="ListParagraph"/>
         <w:numPr>
           <w:ilvl w:val="2"/>
           <w:numId w:val="15"/>
@@ -8057,7 +8049,7 @@
     </w:p>
     <w:p>
       <w:pPr>
-        <w:pStyle w:val="a9"/>
+        <w:pStyle w:val="ListParagraph"/>
         <w:numPr>
           <w:ilvl w:val="1"/>
           <w:numId w:val="15"/>
@@ -8167,7 +8159,7 @@
     </w:p>
     <w:p>
       <w:pPr>
-        <w:pStyle w:val="a9"/>
+        <w:pStyle w:val="ListParagraph"/>
         <w:numPr>
           <w:ilvl w:val="0"/>
           <w:numId w:val="18"/>
@@ -8216,7 +8208,7 @@
     </w:p>
     <w:p>
       <w:pPr>
-        <w:pStyle w:val="a9"/>
+        <w:pStyle w:val="ListParagraph"/>
         <w:numPr>
           <w:ilvl w:val="0"/>
           <w:numId w:val="16"/>
@@ -8248,7 +8240,7 @@
     </w:p>
     <w:p>
       <w:pPr>
-        <w:pStyle w:val="a9"/>
+        <w:pStyle w:val="ListParagraph"/>
         <w:numPr>
           <w:ilvl w:val="0"/>
           <w:numId w:val="16"/>
@@ -8280,7 +8272,7 @@
     </w:p>
     <w:p>
       <w:pPr>
-        <w:pStyle w:val="a9"/>
+        <w:pStyle w:val="ListParagraph"/>
         <w:numPr>
           <w:ilvl w:val="0"/>
           <w:numId w:val="16"/>
@@ -8312,7 +8304,7 @@
     </w:p>
     <w:p>
       <w:pPr>
-        <w:pStyle w:val="a9"/>
+        <w:pStyle w:val="ListParagraph"/>
         <w:numPr>
           <w:ilvl w:val="0"/>
           <w:numId w:val="16"/>
@@ -8344,7 +8336,7 @@
     </w:p>
     <w:p>
       <w:pPr>
-        <w:pStyle w:val="a9"/>
+        <w:pStyle w:val="ListParagraph"/>
         <w:numPr>
           <w:ilvl w:val="0"/>
           <w:numId w:val="16"/>
@@ -8376,7 +8368,7 @@
     </w:p>
     <w:p>
       <w:pPr>
-        <w:pStyle w:val="a9"/>
+        <w:pStyle w:val="ListParagraph"/>
         <w:numPr>
           <w:ilvl w:val="0"/>
           <w:numId w:val="16"/>
@@ -8408,7 +8400,7 @@
     </w:p>
     <w:p>
       <w:pPr>
-        <w:pStyle w:val="a9"/>
+        <w:pStyle w:val="ListParagraph"/>
         <w:numPr>
           <w:ilvl w:val="0"/>
           <w:numId w:val="16"/>
@@ -8494,7 +8486,7 @@
     </w:p>
     <w:p>
       <w:pPr>
-        <w:pStyle w:val="a9"/>
+        <w:pStyle w:val="ListParagraph"/>
         <w:numPr>
           <w:ilvl w:val="0"/>
           <w:numId w:val="16"/>
@@ -8554,7 +8546,7 @@
     </w:p>
     <w:p>
       <w:pPr>
-        <w:pStyle w:val="a9"/>
+        <w:pStyle w:val="ListParagraph"/>
         <w:numPr>
           <w:ilvl w:val="0"/>
           <w:numId w:val="16"/>
@@ -8618,7 +8610,7 @@
     </w:p>
     <w:p>
       <w:pPr>
-        <w:pStyle w:val="a9"/>
+        <w:pStyle w:val="ListParagraph"/>
         <w:numPr>
           <w:ilvl w:val="0"/>
           <w:numId w:val="16"/>
@@ -8678,7 +8670,7 @@
     </w:p>
     <w:p>
       <w:pPr>
-        <w:pStyle w:val="a9"/>
+        <w:pStyle w:val="ListParagraph"/>
         <w:numPr>
           <w:ilvl w:val="0"/>
           <w:numId w:val="16"/>
@@ -8731,7 +8723,7 @@
     </w:p>
     <w:p>
       <w:pPr>
-        <w:pStyle w:val="a9"/>
+        <w:pStyle w:val="ListParagraph"/>
         <w:numPr>
           <w:ilvl w:val="0"/>
           <w:numId w:val="18"/>
@@ -9602,7 +9594,7 @@
     </w:p>
     <w:p>
       <w:pPr>
-        <w:pStyle w:val="a9"/>
+        <w:pStyle w:val="ListParagraph"/>
         <w:numPr>
           <w:ilvl w:val="0"/>
           <w:numId w:val="3"/>
@@ -9661,7 +9653,7 @@
     </w:p>
     <w:p>
       <w:pPr>
-        <w:pStyle w:val="a9"/>
+        <w:pStyle w:val="ListParagraph"/>
         <w:numPr>
           <w:ilvl w:val="0"/>
           <w:numId w:val="3"/>
@@ -9720,7 +9712,7 @@
     </w:p>
     <w:p>
       <w:pPr>
-        <w:pStyle w:val="a9"/>
+        <w:pStyle w:val="ListParagraph"/>
         <w:numPr>
           <w:ilvl w:val="0"/>
           <w:numId w:val="3"/>
@@ -9779,7 +9771,7 @@
     </w:p>
     <w:p>
       <w:pPr>
-        <w:pStyle w:val="a9"/>
+        <w:pStyle w:val="ListParagraph"/>
         <w:numPr>
           <w:ilvl w:val="0"/>
           <w:numId w:val="3"/>
@@ -9838,7 +9830,7 @@
     </w:p>
     <w:p>
       <w:pPr>
-        <w:pStyle w:val="a9"/>
+        <w:pStyle w:val="ListParagraph"/>
         <w:numPr>
           <w:ilvl w:val="0"/>
           <w:numId w:val="3"/>
@@ -9915,7 +9907,7 @@
     </w:p>
     <w:p>
       <w:pPr>
-        <w:pStyle w:val="a9"/>
+        <w:pStyle w:val="ListParagraph"/>
         <w:numPr>
           <w:ilvl w:val="0"/>
           <w:numId w:val="3"/>
@@ -9974,7 +9966,7 @@
     </w:p>
     <w:p>
       <w:pPr>
-        <w:pStyle w:val="a9"/>
+        <w:pStyle w:val="ListParagraph"/>
         <w:numPr>
           <w:ilvl w:val="0"/>
           <w:numId w:val="3"/>
@@ -10601,7 +10593,7 @@
     </w:p>
     <w:p>
       <w:pPr>
-        <w:pStyle w:val="a9"/>
+        <w:pStyle w:val="ListParagraph"/>
         <w:numPr>
           <w:ilvl w:val="0"/>
           <w:numId w:val="2"/>
@@ -10715,7 +10707,7 @@
     </w:p>
     <w:p>
       <w:pPr>
-        <w:pStyle w:val="a9"/>
+        <w:pStyle w:val="ListParagraph"/>
         <w:numPr>
           <w:ilvl w:val="0"/>
           <w:numId w:val="2"/>
@@ -10829,7 +10821,7 @@
     </w:p>
     <w:p>
       <w:pPr>
-        <w:pStyle w:val="a9"/>
+        <w:pStyle w:val="ListParagraph"/>
         <w:numPr>
           <w:ilvl w:val="0"/>
           <w:numId w:val="2"/>
@@ -13184,6 +13176,188 @@
         </w:rPr>
         <w:t>Рис.9</w:t>
       </w:r>
+    </w:p>
+    <w:p>
+      <w:pPr>
+        <w:rPr>
+          <w:rFonts w:ascii="Times New Roman" w:hAnsi="Times New Roman" w:cs="Times New Roman"/>
+          <w:sz w:val="28"/>
+          <w:szCs w:val="28"/>
+        </w:rPr>
+      </w:pPr>
+      <w:r>
+        <w:rPr>
+          <w:rFonts w:ascii="Times New Roman" w:hAnsi="Times New Roman" w:cs="Times New Roman"/>
+          <w:sz w:val="28"/>
+          <w:szCs w:val="28"/>
+        </w:rPr>
+        <w:br w:type="page"/>
+      </w:r>
+    </w:p>
+    <w:p>
+      <w:pPr>
+        <w:tabs>
+          <w:tab w:val="left" w:pos="560"/>
+          <w:tab w:val="left" w:pos="1120"/>
+          <w:tab w:val="left" w:pos="1680"/>
+          <w:tab w:val="left" w:pos="2240"/>
+          <w:tab w:val="left" w:pos="2800"/>
+          <w:tab w:val="left" w:pos="3360"/>
+          <w:tab w:val="left" w:pos="3920"/>
+          <w:tab w:val="left" w:pos="4480"/>
+          <w:tab w:val="left" w:pos="5040"/>
+          <w:tab w:val="left" w:pos="5600"/>
+          <w:tab w:val="left" w:pos="6160"/>
+          <w:tab w:val="left" w:pos="6720"/>
+        </w:tabs>
+        <w:autoSpaceDE w:val="0"/>
+        <w:autoSpaceDN w:val="0"/>
+        <w:adjustRightInd w:val="0"/>
+        <w:spacing w:after="0" w:line="240" w:lineRule="auto"/>
+        <w:ind w:right="-563"/>
+        <w:rPr>
+          <w:rFonts w:ascii="Times New Roman" w:hAnsi="Times New Roman" w:cs="Times New Roman"/>
+          <w:sz w:val="28"/>
+          <w:szCs w:val="28"/>
+          <w:u w:val="single"/>
+        </w:rPr>
+      </w:pPr>
+      <w:r>
+        <w:rPr>
+          <w:rFonts w:ascii="Times New Roman" w:hAnsi="Times New Roman" w:cs="Times New Roman"/>
+          <w:sz w:val="28"/>
+          <w:szCs w:val="28"/>
+          <w:u w:val="single"/>
+        </w:rPr>
+        <w:lastRenderedPageBreak/>
+        <w:t xml:space="preserve">Класи пакету </w:t>
+      </w:r>
+      <w:proofErr w:type="spellStart"/>
+      <w:r>
+        <w:rPr>
+          <w:rFonts w:ascii="Times New Roman" w:hAnsi="Times New Roman" w:cs="Times New Roman"/>
+          <w:sz w:val="28"/>
+          <w:szCs w:val="28"/>
+          <w:u w:val="single"/>
+        </w:rPr>
+        <w:t>network</w:t>
+      </w:r>
+      <w:proofErr w:type="spellEnd"/>
+    </w:p>
+    <w:p>
+      <w:pPr>
+        <w:tabs>
+          <w:tab w:val="left" w:pos="560"/>
+          <w:tab w:val="left" w:pos="1120"/>
+          <w:tab w:val="left" w:pos="1680"/>
+          <w:tab w:val="left" w:pos="2240"/>
+          <w:tab w:val="left" w:pos="2800"/>
+          <w:tab w:val="left" w:pos="3360"/>
+          <w:tab w:val="left" w:pos="3920"/>
+          <w:tab w:val="left" w:pos="4480"/>
+          <w:tab w:val="left" w:pos="5040"/>
+          <w:tab w:val="left" w:pos="5600"/>
+          <w:tab w:val="left" w:pos="6160"/>
+          <w:tab w:val="left" w:pos="6720"/>
+        </w:tabs>
+        <w:autoSpaceDE w:val="0"/>
+        <w:autoSpaceDN w:val="0"/>
+        <w:adjustRightInd w:val="0"/>
+        <w:spacing w:after="0" w:line="240" w:lineRule="auto"/>
+        <w:ind w:right="-563"/>
+        <w:rPr>
+          <w:rFonts w:ascii="Times New Roman" w:hAnsi="Times New Roman" w:cs="Times New Roman"/>
+          <w:sz w:val="28"/>
+          <w:szCs w:val="28"/>
+          <w:lang w:val="en-US"/>
+        </w:rPr>
+      </w:pPr>
+      <w:r>
+        <w:rPr>
+          <w:rFonts w:ascii="Times New Roman" w:hAnsi="Times New Roman" w:cs="Times New Roman"/>
+          <w:sz w:val="28"/>
+          <w:szCs w:val="28"/>
+        </w:rPr>
+        <w:t xml:space="preserve">На рисунку </w:t>
+      </w:r>
+      <w:r>
+        <w:rPr>
+          <w:rFonts w:ascii="Times New Roman" w:hAnsi="Times New Roman" w:cs="Times New Roman"/>
+          <w:sz w:val="28"/>
+          <w:szCs w:val="28"/>
+        </w:rPr>
+        <w:t>10</w:t>
+      </w:r>
+      <w:r>
+        <w:rPr>
+          <w:rFonts w:ascii="Times New Roman" w:hAnsi="Times New Roman" w:cs="Times New Roman"/>
+          <w:sz w:val="28"/>
+          <w:szCs w:val="28"/>
+        </w:rPr>
+        <w:t xml:space="preserve"> подано UML-діаграму класів пакета</w:t>
+      </w:r>
+      <w:r>
+        <w:rPr>
+          <w:rFonts w:ascii="Times New Roman" w:hAnsi="Times New Roman" w:cs="Times New Roman"/>
+          <w:sz w:val="28"/>
+          <w:szCs w:val="28"/>
+        </w:rPr>
+        <w:t xml:space="preserve"> </w:t>
+      </w:r>
+      <w:proofErr w:type="spellStart"/>
+      <w:r>
+        <w:rPr>
+          <w:rFonts w:ascii="Times New Roman" w:hAnsi="Times New Roman" w:cs="Times New Roman"/>
+          <w:sz w:val="28"/>
+          <w:szCs w:val="28"/>
+        </w:rPr>
+        <w:t>network</w:t>
+      </w:r>
+      <w:proofErr w:type="spellEnd"/>
+      <w:r>
+        <w:rPr>
+          <w:rFonts w:ascii="Times New Roman" w:hAnsi="Times New Roman" w:cs="Times New Roman"/>
+          <w:sz w:val="28"/>
+          <w:szCs w:val="28"/>
+        </w:rPr>
+        <w:t xml:space="preserve">, </w:t>
+      </w:r>
+      <w:r>
+        <w:rPr>
+          <w:rFonts w:ascii="Times New Roman" w:hAnsi="Times New Roman" w:cs="Times New Roman"/>
+          <w:sz w:val="28"/>
+          <w:szCs w:val="28"/>
+        </w:rPr>
+        <w:t>який відповідає за реалізацію мережевого режиму роботи системи.</w:t>
+      </w:r>
+    </w:p>
+    <w:p>
+      <w:pPr>
+        <w:tabs>
+          <w:tab w:val="left" w:pos="560"/>
+          <w:tab w:val="left" w:pos="1120"/>
+          <w:tab w:val="left" w:pos="1680"/>
+          <w:tab w:val="left" w:pos="2240"/>
+          <w:tab w:val="left" w:pos="2800"/>
+          <w:tab w:val="left" w:pos="3360"/>
+          <w:tab w:val="left" w:pos="3920"/>
+          <w:tab w:val="left" w:pos="4480"/>
+          <w:tab w:val="left" w:pos="5040"/>
+          <w:tab w:val="left" w:pos="5600"/>
+          <w:tab w:val="left" w:pos="6160"/>
+          <w:tab w:val="left" w:pos="6720"/>
+        </w:tabs>
+        <w:autoSpaceDE w:val="0"/>
+        <w:autoSpaceDN w:val="0"/>
+        <w:adjustRightInd w:val="0"/>
+        <w:spacing w:after="0" w:line="240" w:lineRule="auto"/>
+        <w:ind w:right="-563"/>
+        <w:rPr>
+          <w:rFonts w:ascii="Times New Roman" w:hAnsi="Times New Roman" w:cs="Times New Roman"/>
+          <w:sz w:val="28"/>
+          <w:szCs w:val="28"/>
+        </w:rPr>
+      </w:pPr>
       <w:r>
         <w:rPr>
           <w:rFonts w:ascii="Times New Roman" w:hAnsi="Times New Roman" w:cs="Times New Roman"/>
@@ -13191,6 +13365,96 @@
           <w:szCs w:val="28"/>
         </w:rPr>
         <w:br/>
+      </w:r>
+    </w:p>
+    <w:p>
+      <w:pPr>
+        <w:tabs>
+          <w:tab w:val="left" w:pos="560"/>
+          <w:tab w:val="left" w:pos="1120"/>
+          <w:tab w:val="left" w:pos="1680"/>
+          <w:tab w:val="left" w:pos="2240"/>
+          <w:tab w:val="left" w:pos="2800"/>
+          <w:tab w:val="left" w:pos="3360"/>
+          <w:tab w:val="left" w:pos="3920"/>
+          <w:tab w:val="left" w:pos="4480"/>
+          <w:tab w:val="left" w:pos="5040"/>
+          <w:tab w:val="left" w:pos="5600"/>
+          <w:tab w:val="left" w:pos="6160"/>
+          <w:tab w:val="left" w:pos="6720"/>
+        </w:tabs>
+        <w:autoSpaceDE w:val="0"/>
+        <w:autoSpaceDN w:val="0"/>
+        <w:adjustRightInd w:val="0"/>
+        <w:spacing w:after="0" w:line="240" w:lineRule="auto"/>
+        <w:ind w:right="-563"/>
+        <w:rPr>
+          <w:rFonts w:ascii="Times New Roman" w:hAnsi="Times New Roman" w:cs="Times New Roman"/>
+          <w:sz w:val="28"/>
+          <w:szCs w:val="28"/>
+        </w:rPr>
+      </w:pPr>
+      <w:r>
+        <w:rPr>
+          <w:rFonts w:ascii="Times New Roman" w:hAnsi="Times New Roman" w:cs="Times New Roman"/>
+          <w:sz w:val="28"/>
+          <w:szCs w:val="28"/>
+        </w:rPr>
+        <w:drawing>
+          <wp:anchor distT="0" distB="0" distL="114300" distR="114300" simplePos="0" relativeHeight="251671552" behindDoc="0" locked="0" layoutInCell="1" allowOverlap="1" wp14:anchorId="4DB4EACC" wp14:editId="6C6D7188">
+            <wp:simplePos x="0" y="0"/>
+            <wp:positionH relativeFrom="column">
+              <wp:posOffset>0</wp:posOffset>
+            </wp:positionH>
+            <wp:positionV relativeFrom="paragraph">
+              <wp:posOffset>0</wp:posOffset>
+            </wp:positionV>
+            <wp:extent cx="4459266" cy="5044419"/>
+            <wp:effectExtent l="0" t="0" r="0" b="0"/>
+            <wp:wrapTopAndBottom/>
+            <wp:docPr id="329474315" name="Picture 1"/>
+            <wp:cNvGraphicFramePr>
+              <a:graphicFrameLocks xmlns:a="http://schemas.openxmlformats.org/drawingml/2006/main" noChangeAspect="1"/>
+            </wp:cNvGraphicFramePr>
+            <a:graphic xmlns:a="http://schemas.openxmlformats.org/drawingml/2006/main">
+              <a:graphicData uri="http://schemas.openxmlformats.org/drawingml/2006/picture">
+                <pic:pic xmlns:pic="http://schemas.openxmlformats.org/drawingml/2006/picture">
+                  <pic:nvPicPr>
+                    <pic:cNvPr id="329474315" name=""/>
+                    <pic:cNvPicPr/>
+                  </pic:nvPicPr>
+                  <pic:blipFill>
+                    <a:blip r:embed="rId17">
+                      <a:extLst>
+                        <a:ext uri="{28A0092B-C50C-407E-A947-70E740481C1C}">
+                          <a14:useLocalDpi xmlns:a14="http://schemas.microsoft.com/office/drawing/2010/main" val="0"/>
+                        </a:ext>
+                      </a:extLst>
+                    </a:blip>
+                    <a:stretch>
+                      <a:fillRect/>
+                    </a:stretch>
+                  </pic:blipFill>
+                  <pic:spPr>
+                    <a:xfrm>
+                      <a:off x="0" y="0"/>
+                      <a:ext cx="4459266" cy="5044419"/>
+                    </a:xfrm>
+                    <a:prstGeom prst="rect">
+                      <a:avLst/>
+                    </a:prstGeom>
+                  </pic:spPr>
+                </pic:pic>
+              </a:graphicData>
+            </a:graphic>
+            <wp14:sizeRelH relativeFrom="page">
+              <wp14:pctWidth>0</wp14:pctWidth>
+            </wp14:sizeRelH>
+            <wp14:sizeRelV relativeFrom="page">
+              <wp14:pctHeight>0</wp14:pctHeight>
+            </wp14:sizeRelV>
+          </wp:anchor>
+        </w:drawing>
       </w:r>
     </w:p>
     <w:p>
@@ -13217,7 +13481,7 @@
     </w:p>
     <w:p>
       <w:pPr>
-        <w:pStyle w:val="a9"/>
+        <w:pStyle w:val="ListParagraph"/>
         <w:numPr>
           <w:ilvl w:val="0"/>
           <w:numId w:val="18"/>
@@ -13750,7 +14014,7 @@
     </w:p>
     <w:p>
       <w:pPr>
-        <w:pStyle w:val="a9"/>
+        <w:pStyle w:val="ListParagraph"/>
         <w:numPr>
           <w:ilvl w:val="0"/>
           <w:numId w:val="17"/>
@@ -13842,7 +14106,7 @@
     </w:p>
     <w:p>
       <w:pPr>
-        <w:pStyle w:val="a9"/>
+        <w:pStyle w:val="ListParagraph"/>
         <w:numPr>
           <w:ilvl w:val="0"/>
           <w:numId w:val="17"/>
@@ -13880,27 +14144,7 @@
           <w:sz w:val="28"/>
           <w:szCs w:val="28"/>
         </w:rPr>
-        <w:t>логік</w:t>
-      </w:r>
-      <w:r>
-        <w:rPr>
-          <w:rFonts w:ascii="Times New Roman" w:hAnsi="Times New Roman" w:cs="Times New Roman"/>
-          <w:i/>
-          <w:iCs/>
-          <w:sz w:val="28"/>
-          <w:szCs w:val="28"/>
-        </w:rPr>
-        <w:t>а</w:t>
-      </w:r>
-      <w:r>
-        <w:rPr>
-          <w:rFonts w:ascii="Times New Roman" w:hAnsi="Times New Roman" w:cs="Times New Roman"/>
-          <w:i/>
-          <w:iCs/>
-          <w:sz w:val="28"/>
-          <w:szCs w:val="28"/>
-        </w:rPr>
-        <w:t xml:space="preserve"> функціонування системи та взаємодії її компонентів</w:t>
+        <w:t>логіка функціонування системи та взаємодії її компонентів</w:t>
       </w:r>
       <w:r>
         <w:rPr>
@@ -13939,7 +14183,7 @@
     </w:p>
     <w:p>
       <w:pPr>
-        <w:pStyle w:val="a9"/>
+        <w:pStyle w:val="ListParagraph"/>
         <w:numPr>
           <w:ilvl w:val="0"/>
           <w:numId w:val="17"/>
@@ -14054,7 +14298,7 @@
     </w:p>
     <w:p>
       <w:pPr>
-        <w:pStyle w:val="a9"/>
+        <w:pStyle w:val="ListParagraph"/>
         <w:numPr>
           <w:ilvl w:val="0"/>
           <w:numId w:val="17"/>
@@ -14227,7 +14471,7 @@
     </w:p>
     <w:p>
       <w:pPr>
-        <w:pStyle w:val="a9"/>
+        <w:pStyle w:val="ListParagraph"/>
         <w:numPr>
           <w:ilvl w:val="0"/>
           <w:numId w:val="17"/>
@@ -14446,7 +14690,7 @@
     </w:p>
     <w:p>
       <w:pPr>
-        <w:pStyle w:val="a9"/>
+        <w:pStyle w:val="ListParagraph"/>
         <w:numPr>
           <w:ilvl w:val="0"/>
           <w:numId w:val="17"/>
@@ -14578,7 +14822,7 @@
     </w:p>
     <w:p>
       <w:pPr>
-        <w:pStyle w:val="a9"/>
+        <w:pStyle w:val="ListParagraph"/>
         <w:numPr>
           <w:ilvl w:val="0"/>
           <w:numId w:val="17"/>
@@ -14666,7 +14910,7 @@
     </w:p>
     <w:p>
       <w:pPr>
-        <w:pStyle w:val="a9"/>
+        <w:pStyle w:val="ListParagraph"/>
         <w:numPr>
           <w:ilvl w:val="0"/>
           <w:numId w:val="17"/>
@@ -14739,7 +14983,7 @@
     </w:p>
     <w:p>
       <w:pPr>
-        <w:pStyle w:val="a9"/>
+        <w:pStyle w:val="ListParagraph"/>
         <w:numPr>
           <w:ilvl w:val="0"/>
           <w:numId w:val="18"/>
@@ -15156,7 +15400,7 @@
     </w:p>
     <w:p>
       <w:pPr>
-        <w:pStyle w:val="a9"/>
+        <w:pStyle w:val="ListParagraph"/>
         <w:numPr>
           <w:ilvl w:val="0"/>
           <w:numId w:val="18"/>
@@ -15273,10 +15517,10 @@
           <w:lang w:val="en-US"/>
         </w:rPr>
       </w:pPr>
-      <w:hyperlink r:id="rId17" w:history="1">
+      <w:hyperlink r:id="rId18" w:history="1">
         <w:r>
           <w:rPr>
-            <w:rStyle w:val="af2"/>
+            <w:rStyle w:val="Hyperlink"/>
             <w:rFonts w:ascii="Times New Roman" w:hAnsi="Times New Roman" w:cs="Times New Roman"/>
             <w:sz w:val="28"/>
             <w:szCs w:val="28"/>
@@ -15316,8 +15560,8 @@
       </w:pPr>
     </w:p>
     <w:sectPr>
-      <w:footerReference w:type="default" r:id="rId18"/>
-      <w:footerReference w:type="first" r:id="rId19"/>
+      <w:footerReference w:type="default" r:id="rId19"/>
+      <w:footerReference w:type="first" r:id="rId20"/>
       <w:pgSz w:w="12240" w:h="15840"/>
       <w:pgMar w:top="670" w:right="1440" w:bottom="1054" w:left="1440" w:header="708" w:footer="708" w:gutter="0"/>
       <w:cols w:space="708"/>
@@ -15357,7 +15601,7 @@
 <w:ftr xmlns:wpc="http://schemas.microsoft.com/office/word/2010/wordprocessingCanvas" xmlns:cx="http://schemas.microsoft.com/office/drawing/2014/chartex" xmlns:cx1="http://schemas.microsoft.com/office/drawing/2015/9/8/chartex" xmlns:cx2="http://schemas.microsoft.com/office/drawing/2015/10/21/chartex" xmlns:cx3="http://schemas.microsoft.com/office/drawing/2016/5/9/chartex" xmlns:cx4="http://schemas.microsoft.com/office/drawing/2016/5/10/chartex" xmlns:cx5="http://schemas.microsoft.com/office/drawing/2016/5/11/chartex" xmlns:cx6="http://schemas.microsoft.com/office/drawing/2016/5/12/chartex" xmlns:cx7="http://schemas.microsoft.com/office/drawing/2016/5/13/chartex" xmlns:cx8="http://schemas.microsoft.com/office/drawing/2016/5/14/chartex" xmlns:mc="http://schemas.openxmlformats.org/markup-compatibility/2006" xmlns:aink="http://schemas.microsoft.com/office/drawing/2016/ink" xmlns:am3d="http://schemas.microsoft.com/office/drawing/2017/model3d" xmlns:o="urn:schemas-microsoft-com:office:office" xmlns:oel="http://schemas.microsoft.com/office/2019/extlst" xmlns:r="http://schemas.openxmlformats.org/officeDocument/2006/relationships" xmlns:m="http://schemas.openxmlformats.org/officeDocument/2006/math" xmlns:v="urn:schemas-microsoft-com:vml" xmlns:wp14="http://schemas.microsoft.com/office/word/2010/wordprocessingDrawing" xmlns:wp="http://schemas.openxmlformats.org/drawingml/2006/wordprocessingDrawing" xmlns:w10="urn:schemas-microsoft-com:office:word" xmlns:w="http://schemas.openxmlformats.org/wordprocessingml/2006/main" xmlns:w14="http://schemas.microsoft.com/office/word/2010/wordml" xmlns:w15="http://schemas.microsoft.com/office/word/2012/wordml" xmlns:w16cex="http://schemas.microsoft.com/office/word/2018/wordml/cex" xmlns:w16cid="http://schemas.microsoft.com/office/word/2016/wordml/cid" xmlns:w16="http://schemas.microsoft.com/office/word/2018/wordml" xmlns:w16du="http://schemas.microsoft.com/office/word/2023/wordml/word16du" xmlns:w16sdtdh="http://schemas.microsoft.com/office/word/2020/wordml/sdtdatahash" xmlns:w16sdtfl="http://schemas.microsoft.com/office/word/2024/wordml/sdtformatlock" xmlns:w16se="http://schemas.microsoft.com/office/word/2015/wordml/symex" xmlns:wpg="http://schemas.microsoft.com/office/word/2010/wordprocessingGroup" xmlns:wpi="http://schemas.microsoft.com/office/word/2010/wordprocessingInk" xmlns:wne="http://schemas.microsoft.com/office/word/2006/wordml" xmlns:wps="http://schemas.microsoft.com/office/word/2010/wordprocessingShape" mc:Ignorable="w14 w15 w16se w16cid w16 w16cex w16sdtdh w16sdtfl w16du wp14">
   <w:p>
     <w:pPr>
-      <w:pStyle w:val="af0"/>
+      <w:pStyle w:val="Footer"/>
       <w:jc w:val="center"/>
       <w:rPr>
         <w:rFonts w:ascii="Arial" w:hAnsi="Arial" w:cs="Arial"/>
@@ -15371,7 +15615,7 @@
 <w:ftr xmlns:wpc="http://schemas.microsoft.com/office/word/2010/wordprocessingCanvas" xmlns:cx="http://schemas.microsoft.com/office/drawing/2014/chartex" xmlns:cx1="http://schemas.microsoft.com/office/drawing/2015/9/8/chartex" xmlns:cx2="http://schemas.microsoft.com/office/drawing/2015/10/21/chartex" xmlns:cx3="http://schemas.microsoft.com/office/drawing/2016/5/9/chartex" xmlns:cx4="http://schemas.microsoft.com/office/drawing/2016/5/10/chartex" xmlns:cx5="http://schemas.microsoft.com/office/drawing/2016/5/11/chartex" xmlns:cx6="http://schemas.microsoft.com/office/drawing/2016/5/12/chartex" xmlns:cx7="http://schemas.microsoft.com/office/drawing/2016/5/13/chartex" xmlns:cx8="http://schemas.microsoft.com/office/drawing/2016/5/14/chartex" xmlns:mc="http://schemas.openxmlformats.org/markup-compatibility/2006" xmlns:aink="http://schemas.microsoft.com/office/drawing/2016/ink" xmlns:am3d="http://schemas.microsoft.com/office/drawing/2017/model3d" xmlns:o="urn:schemas-microsoft-com:office:office" xmlns:oel="http://schemas.microsoft.com/office/2019/extlst" xmlns:r="http://schemas.openxmlformats.org/officeDocument/2006/relationships" xmlns:m="http://schemas.openxmlformats.org/officeDocument/2006/math" xmlns:v="urn:schemas-microsoft-com:vml" xmlns:wp14="http://schemas.microsoft.com/office/word/2010/wordprocessingDrawing" xmlns:wp="http://schemas.openxmlformats.org/drawingml/2006/wordprocessingDrawing" xmlns:w10="urn:schemas-microsoft-com:office:word" xmlns:w="http://schemas.openxmlformats.org/wordprocessingml/2006/main" xmlns:w14="http://schemas.microsoft.com/office/word/2010/wordml" xmlns:w15="http://schemas.microsoft.com/office/word/2012/wordml" xmlns:w16cex="http://schemas.microsoft.com/office/word/2018/wordml/cex" xmlns:w16cid="http://schemas.microsoft.com/office/word/2016/wordml/cid" xmlns:w16="http://schemas.microsoft.com/office/word/2018/wordml" xmlns:w16du="http://schemas.microsoft.com/office/word/2023/wordml/word16du" xmlns:w16sdtdh="http://schemas.microsoft.com/office/word/2020/wordml/sdtdatahash" xmlns:w16sdtfl="http://schemas.microsoft.com/office/word/2024/wordml/sdtformatlock" xmlns:w16se="http://schemas.microsoft.com/office/word/2015/wordml/symex" xmlns:wpg="http://schemas.microsoft.com/office/word/2010/wordprocessingGroup" xmlns:wpi="http://schemas.microsoft.com/office/word/2010/wordprocessingInk" xmlns:wne="http://schemas.microsoft.com/office/word/2006/wordml" xmlns:wps="http://schemas.microsoft.com/office/word/2010/wordprocessingShape" mc:Ignorable="w14 w15 w16se w16cid w16 w16cex w16sdtdh w16sdtfl w16du wp14">
   <w:p>
     <w:pPr>
-      <w:pStyle w:val="af0"/>
+      <w:pStyle w:val="Footer"/>
       <w:jc w:val="center"/>
       <w:rPr>
         <w:rFonts w:ascii="Times New Roman" w:hAnsi="Times New Roman" w:cs="Times New Roman"/>
@@ -18270,15 +18514,15 @@
     <w:lsdException w:name="Unresolved Mention" w:semiHidden="1" w:unhideWhenUsed="1"/>
     <w:lsdException w:name="Smart Link" w:semiHidden="1" w:unhideWhenUsed="1"/>
   </w:latentStyles>
-  <w:style w:type="paragraph" w:default="1" w:styleId="a">
+  <w:style w:type="paragraph" w:default="1" w:styleId="Normal">
     <w:name w:val="Normal"/>
     <w:qFormat/>
   </w:style>
-  <w:style w:type="paragraph" w:styleId="1">
+  <w:style w:type="paragraph" w:styleId="Heading1">
     <w:name w:val="heading 1"/>
-    <w:basedOn w:val="a"/>
-    <w:next w:val="a"/>
-    <w:link w:val="10"/>
+    <w:basedOn w:val="Normal"/>
+    <w:next w:val="Normal"/>
+    <w:link w:val="Heading1Char"/>
     <w:uiPriority w:val="9"/>
     <w:qFormat/>
     <w:rsid w:val="00FD6400"/>
@@ -18295,11 +18539,11 @@
       <w:szCs w:val="40"/>
     </w:rPr>
   </w:style>
-  <w:style w:type="paragraph" w:styleId="2">
+  <w:style w:type="paragraph" w:styleId="Heading2">
     <w:name w:val="heading 2"/>
-    <w:basedOn w:val="a"/>
-    <w:next w:val="a"/>
-    <w:link w:val="20"/>
+    <w:basedOn w:val="Normal"/>
+    <w:next w:val="Normal"/>
+    <w:link w:val="Heading2Char"/>
     <w:uiPriority w:val="9"/>
     <w:semiHidden/>
     <w:unhideWhenUsed/>
@@ -18318,11 +18562,11 @@
       <w:szCs w:val="32"/>
     </w:rPr>
   </w:style>
-  <w:style w:type="paragraph" w:styleId="3">
+  <w:style w:type="paragraph" w:styleId="Heading3">
     <w:name w:val="heading 3"/>
-    <w:basedOn w:val="a"/>
-    <w:next w:val="a"/>
-    <w:link w:val="30"/>
+    <w:basedOn w:val="Normal"/>
+    <w:next w:val="Normal"/>
+    <w:link w:val="Heading3Char"/>
     <w:uiPriority w:val="9"/>
     <w:semiHidden/>
     <w:unhideWhenUsed/>
@@ -18341,11 +18585,11 @@
       <w:szCs w:val="28"/>
     </w:rPr>
   </w:style>
-  <w:style w:type="paragraph" w:styleId="4">
+  <w:style w:type="paragraph" w:styleId="Heading4">
     <w:name w:val="heading 4"/>
-    <w:basedOn w:val="a"/>
-    <w:next w:val="a"/>
-    <w:link w:val="40"/>
+    <w:basedOn w:val="Normal"/>
+    <w:next w:val="Normal"/>
+    <w:link w:val="Heading4Char"/>
     <w:uiPriority w:val="9"/>
     <w:semiHidden/>
     <w:unhideWhenUsed/>
@@ -18364,11 +18608,11 @@
       <w:color w:val="0F4761" w:themeColor="accent1" w:themeShade="BF"/>
     </w:rPr>
   </w:style>
-  <w:style w:type="paragraph" w:styleId="5">
+  <w:style w:type="paragraph" w:styleId="Heading5">
     <w:name w:val="heading 5"/>
-    <w:basedOn w:val="a"/>
-    <w:next w:val="a"/>
-    <w:link w:val="50"/>
+    <w:basedOn w:val="Normal"/>
+    <w:next w:val="Normal"/>
+    <w:link w:val="Heading5Char"/>
     <w:uiPriority w:val="9"/>
     <w:semiHidden/>
     <w:unhideWhenUsed/>
@@ -18385,11 +18629,11 @@
       <w:color w:val="0F4761" w:themeColor="accent1" w:themeShade="BF"/>
     </w:rPr>
   </w:style>
-  <w:style w:type="paragraph" w:styleId="6">
+  <w:style w:type="paragraph" w:styleId="Heading6">
     <w:name w:val="heading 6"/>
-    <w:basedOn w:val="a"/>
-    <w:next w:val="a"/>
-    <w:link w:val="60"/>
+    <w:basedOn w:val="Normal"/>
+    <w:next w:val="Normal"/>
+    <w:link w:val="Heading6Char"/>
     <w:uiPriority w:val="9"/>
     <w:semiHidden/>
     <w:unhideWhenUsed/>
@@ -18408,11 +18652,11 @@
       <w:color w:val="595959" w:themeColor="text1" w:themeTint="A6"/>
     </w:rPr>
   </w:style>
-  <w:style w:type="paragraph" w:styleId="7">
+  <w:style w:type="paragraph" w:styleId="Heading7">
     <w:name w:val="heading 7"/>
-    <w:basedOn w:val="a"/>
-    <w:next w:val="a"/>
-    <w:link w:val="70"/>
+    <w:basedOn w:val="Normal"/>
+    <w:next w:val="Normal"/>
+    <w:link w:val="Heading7Char"/>
     <w:uiPriority w:val="9"/>
     <w:semiHidden/>
     <w:unhideWhenUsed/>
@@ -18429,11 +18673,11 @@
       <w:color w:val="595959" w:themeColor="text1" w:themeTint="A6"/>
     </w:rPr>
   </w:style>
-  <w:style w:type="paragraph" w:styleId="8">
+  <w:style w:type="paragraph" w:styleId="Heading8">
     <w:name w:val="heading 8"/>
-    <w:basedOn w:val="a"/>
-    <w:next w:val="a"/>
-    <w:link w:val="80"/>
+    <w:basedOn w:val="Normal"/>
+    <w:next w:val="Normal"/>
+    <w:link w:val="Heading8Char"/>
     <w:uiPriority w:val="9"/>
     <w:semiHidden/>
     <w:unhideWhenUsed/>
@@ -18452,11 +18696,11 @@
       <w:color w:val="272727" w:themeColor="text1" w:themeTint="D8"/>
     </w:rPr>
   </w:style>
-  <w:style w:type="paragraph" w:styleId="9">
+  <w:style w:type="paragraph" w:styleId="Heading9">
     <w:name w:val="heading 9"/>
-    <w:basedOn w:val="a"/>
-    <w:next w:val="a"/>
-    <w:link w:val="90"/>
+    <w:basedOn w:val="Normal"/>
+    <w:next w:val="Normal"/>
+    <w:link w:val="Heading9Char"/>
     <w:uiPriority w:val="9"/>
     <w:semiHidden/>
     <w:unhideWhenUsed/>
@@ -18473,12 +18717,13 @@
       <w:color w:val="272727" w:themeColor="text1" w:themeTint="D8"/>
     </w:rPr>
   </w:style>
-  <w:style w:type="character" w:default="1" w:styleId="a0">
+  <w:style w:type="character" w:default="1" w:styleId="DefaultParagraphFont">
     <w:name w:val="Default Paragraph Font"/>
     <w:uiPriority w:val="1"/>
+    <w:semiHidden/>
     <w:unhideWhenUsed/>
   </w:style>
-  <w:style w:type="table" w:default="1" w:styleId="a1">
+  <w:style w:type="table" w:default="1" w:styleId="TableNormal">
     <w:name w:val="Normal Table"/>
     <w:uiPriority w:val="99"/>
     <w:semiHidden/>
@@ -18493,16 +18738,16 @@
       </w:tblCellMar>
     </w:tblPr>
   </w:style>
-  <w:style w:type="numbering" w:default="1" w:styleId="a2">
+  <w:style w:type="numbering" w:default="1" w:styleId="NoList">
     <w:name w:val="No List"/>
     <w:uiPriority w:val="99"/>
     <w:semiHidden/>
     <w:unhideWhenUsed/>
   </w:style>
-  <w:style w:type="character" w:customStyle="1" w:styleId="10">
-    <w:name w:val="Заголовок 1 Знак"/>
-    <w:basedOn w:val="a0"/>
-    <w:link w:val="1"/>
+  <w:style w:type="character" w:customStyle="1" w:styleId="Heading1Char">
+    <w:name w:val="Heading 1 Char"/>
+    <w:basedOn w:val="DefaultParagraphFont"/>
+    <w:link w:val="Heading1"/>
     <w:uiPriority w:val="9"/>
     <w:rsid w:val="00FD6400"/>
     <w:rPr>
@@ -18512,10 +18757,10 @@
       <w:szCs w:val="40"/>
     </w:rPr>
   </w:style>
-  <w:style w:type="character" w:customStyle="1" w:styleId="20">
-    <w:name w:val="Заголовок 2 Знак"/>
-    <w:basedOn w:val="a0"/>
-    <w:link w:val="2"/>
+  <w:style w:type="character" w:customStyle="1" w:styleId="Heading2Char">
+    <w:name w:val="Heading 2 Char"/>
+    <w:basedOn w:val="DefaultParagraphFont"/>
+    <w:link w:val="Heading2"/>
     <w:uiPriority w:val="9"/>
     <w:semiHidden/>
     <w:rsid w:val="00FD6400"/>
@@ -18526,10 +18771,10 @@
       <w:szCs w:val="32"/>
     </w:rPr>
   </w:style>
-  <w:style w:type="character" w:customStyle="1" w:styleId="30">
-    <w:name w:val="Заголовок 3 Знак"/>
-    <w:basedOn w:val="a0"/>
-    <w:link w:val="3"/>
+  <w:style w:type="character" w:customStyle="1" w:styleId="Heading3Char">
+    <w:name w:val="Heading 3 Char"/>
+    <w:basedOn w:val="DefaultParagraphFont"/>
+    <w:link w:val="Heading3"/>
     <w:uiPriority w:val="9"/>
     <w:semiHidden/>
     <w:rsid w:val="00FD6400"/>
@@ -18540,10 +18785,10 @@
       <w:szCs w:val="28"/>
     </w:rPr>
   </w:style>
-  <w:style w:type="character" w:customStyle="1" w:styleId="40">
-    <w:name w:val="Заголовок 4 Знак"/>
-    <w:basedOn w:val="a0"/>
-    <w:link w:val="4"/>
+  <w:style w:type="character" w:customStyle="1" w:styleId="Heading4Char">
+    <w:name w:val="Heading 4 Char"/>
+    <w:basedOn w:val="DefaultParagraphFont"/>
+    <w:link w:val="Heading4"/>
     <w:uiPriority w:val="9"/>
     <w:semiHidden/>
     <w:rsid w:val="00FD6400"/>
@@ -18554,10 +18799,10 @@
       <w:color w:val="0F4761" w:themeColor="accent1" w:themeShade="BF"/>
     </w:rPr>
   </w:style>
-  <w:style w:type="character" w:customStyle="1" w:styleId="50">
-    <w:name w:val="Заголовок 5 Знак"/>
-    <w:basedOn w:val="a0"/>
-    <w:link w:val="5"/>
+  <w:style w:type="character" w:customStyle="1" w:styleId="Heading5Char">
+    <w:name w:val="Heading 5 Char"/>
+    <w:basedOn w:val="DefaultParagraphFont"/>
+    <w:link w:val="Heading5"/>
     <w:uiPriority w:val="9"/>
     <w:semiHidden/>
     <w:rsid w:val="00FD6400"/>
@@ -18566,10 +18811,10 @@
       <w:color w:val="0F4761" w:themeColor="accent1" w:themeShade="BF"/>
     </w:rPr>
   </w:style>
-  <w:style w:type="character" w:customStyle="1" w:styleId="60">
-    <w:name w:val="Заголовок 6 Знак"/>
-    <w:basedOn w:val="a0"/>
-    <w:link w:val="6"/>
+  <w:style w:type="character" w:customStyle="1" w:styleId="Heading6Char">
+    <w:name w:val="Heading 6 Char"/>
+    <w:basedOn w:val="DefaultParagraphFont"/>
+    <w:link w:val="Heading6"/>
     <w:uiPriority w:val="9"/>
     <w:semiHidden/>
     <w:rsid w:val="00FD6400"/>
@@ -18580,10 +18825,10 @@
       <w:color w:val="595959" w:themeColor="text1" w:themeTint="A6"/>
     </w:rPr>
   </w:style>
-  <w:style w:type="character" w:customStyle="1" w:styleId="70">
-    <w:name w:val="Заголовок 7 Знак"/>
-    <w:basedOn w:val="a0"/>
-    <w:link w:val="7"/>
+  <w:style w:type="character" w:customStyle="1" w:styleId="Heading7Char">
+    <w:name w:val="Heading 7 Char"/>
+    <w:basedOn w:val="DefaultParagraphFont"/>
+    <w:link w:val="Heading7"/>
     <w:uiPriority w:val="9"/>
     <w:semiHidden/>
     <w:rsid w:val="00FD6400"/>
@@ -18592,10 +18837,10 @@
       <w:color w:val="595959" w:themeColor="text1" w:themeTint="A6"/>
     </w:rPr>
   </w:style>
-  <w:style w:type="character" w:customStyle="1" w:styleId="80">
-    <w:name w:val="Заголовок 8 Знак"/>
-    <w:basedOn w:val="a0"/>
-    <w:link w:val="8"/>
+  <w:style w:type="character" w:customStyle="1" w:styleId="Heading8Char">
+    <w:name w:val="Heading 8 Char"/>
+    <w:basedOn w:val="DefaultParagraphFont"/>
+    <w:link w:val="Heading8"/>
     <w:uiPriority w:val="9"/>
     <w:semiHidden/>
     <w:rsid w:val="00FD6400"/>
@@ -18606,10 +18851,10 @@
       <w:color w:val="272727" w:themeColor="text1" w:themeTint="D8"/>
     </w:rPr>
   </w:style>
-  <w:style w:type="character" w:customStyle="1" w:styleId="90">
-    <w:name w:val="Заголовок 9 Знак"/>
-    <w:basedOn w:val="a0"/>
-    <w:link w:val="9"/>
+  <w:style w:type="character" w:customStyle="1" w:styleId="Heading9Char">
+    <w:name w:val="Heading 9 Char"/>
+    <w:basedOn w:val="DefaultParagraphFont"/>
+    <w:link w:val="Heading9"/>
     <w:uiPriority w:val="9"/>
     <w:semiHidden/>
     <w:rsid w:val="00FD6400"/>
@@ -18618,11 +18863,11 @@
       <w:color w:val="272727" w:themeColor="text1" w:themeTint="D8"/>
     </w:rPr>
   </w:style>
-  <w:style w:type="paragraph" w:styleId="a3">
+  <w:style w:type="paragraph" w:styleId="Title">
     <w:name w:val="Title"/>
-    <w:basedOn w:val="a"/>
-    <w:next w:val="a"/>
-    <w:link w:val="a4"/>
+    <w:basedOn w:val="Normal"/>
+    <w:next w:val="Normal"/>
+    <w:link w:val="TitleChar"/>
     <w:uiPriority w:val="10"/>
     <w:qFormat/>
     <w:rsid w:val="00FD6400"/>
@@ -18638,10 +18883,10 @@
       <w:szCs w:val="56"/>
     </w:rPr>
   </w:style>
-  <w:style w:type="character" w:customStyle="1" w:styleId="a4">
-    <w:name w:val="Назва Знак"/>
-    <w:basedOn w:val="a0"/>
-    <w:link w:val="a3"/>
+  <w:style w:type="character" w:customStyle="1" w:styleId="TitleChar">
+    <w:name w:val="Title Char"/>
+    <w:basedOn w:val="DefaultParagraphFont"/>
+    <w:link w:val="Title"/>
     <w:uiPriority w:val="10"/>
     <w:rsid w:val="00FD6400"/>
     <w:rPr>
@@ -18652,11 +18897,11 @@
       <w:szCs w:val="56"/>
     </w:rPr>
   </w:style>
-  <w:style w:type="paragraph" w:styleId="a5">
+  <w:style w:type="paragraph" w:styleId="Subtitle">
     <w:name w:val="Subtitle"/>
-    <w:basedOn w:val="a"/>
-    <w:next w:val="a"/>
-    <w:link w:val="a6"/>
+    <w:basedOn w:val="Normal"/>
+    <w:next w:val="Normal"/>
+    <w:link w:val="SubtitleChar"/>
     <w:uiPriority w:val="11"/>
     <w:qFormat/>
     <w:rsid w:val="00FD6400"/>
@@ -18673,10 +18918,10 @@
       <w:szCs w:val="28"/>
     </w:rPr>
   </w:style>
-  <w:style w:type="character" w:customStyle="1" w:styleId="a6">
-    <w:name w:val="Підзаголовок Знак"/>
-    <w:basedOn w:val="a0"/>
-    <w:link w:val="a5"/>
+  <w:style w:type="character" w:customStyle="1" w:styleId="SubtitleChar">
+    <w:name w:val="Subtitle Char"/>
+    <w:basedOn w:val="DefaultParagraphFont"/>
+    <w:link w:val="Subtitle"/>
     <w:uiPriority w:val="11"/>
     <w:rsid w:val="00FD6400"/>
     <w:rPr>
@@ -18687,11 +18932,11 @@
       <w:szCs w:val="28"/>
     </w:rPr>
   </w:style>
-  <w:style w:type="paragraph" w:styleId="a7">
+  <w:style w:type="paragraph" w:styleId="Quote">
     <w:name w:val="Quote"/>
-    <w:basedOn w:val="a"/>
-    <w:next w:val="a"/>
-    <w:link w:val="a8"/>
+    <w:basedOn w:val="Normal"/>
+    <w:next w:val="Normal"/>
+    <w:link w:val="QuoteChar"/>
     <w:uiPriority w:val="29"/>
     <w:qFormat/>
     <w:rsid w:val="00FD6400"/>
@@ -18705,10 +18950,10 @@
       <w:color w:val="404040" w:themeColor="text1" w:themeTint="BF"/>
     </w:rPr>
   </w:style>
-  <w:style w:type="character" w:customStyle="1" w:styleId="a8">
-    <w:name w:val="Цитата Знак"/>
-    <w:basedOn w:val="a0"/>
-    <w:link w:val="a7"/>
+  <w:style w:type="character" w:customStyle="1" w:styleId="QuoteChar">
+    <w:name w:val="Quote Char"/>
+    <w:basedOn w:val="DefaultParagraphFont"/>
+    <w:link w:val="Quote"/>
     <w:uiPriority w:val="29"/>
     <w:rsid w:val="00FD6400"/>
     <w:rPr>
@@ -18717,9 +18962,9 @@
       <w:color w:val="404040" w:themeColor="text1" w:themeTint="BF"/>
     </w:rPr>
   </w:style>
-  <w:style w:type="paragraph" w:styleId="a9">
+  <w:style w:type="paragraph" w:styleId="ListParagraph">
     <w:name w:val="List Paragraph"/>
-    <w:basedOn w:val="a"/>
+    <w:basedOn w:val="Normal"/>
     <w:uiPriority w:val="34"/>
     <w:qFormat/>
     <w:rsid w:val="00FD6400"/>
@@ -18728,9 +18973,9 @@
       <w:contextualSpacing/>
     </w:pPr>
   </w:style>
-  <w:style w:type="character" w:styleId="aa">
+  <w:style w:type="character" w:styleId="IntenseEmphasis">
     <w:name w:val="Intense Emphasis"/>
-    <w:basedOn w:val="a0"/>
+    <w:basedOn w:val="DefaultParagraphFont"/>
     <w:uiPriority w:val="21"/>
     <w:qFormat/>
     <w:rsid w:val="00FD6400"/>
@@ -18740,11 +18985,11 @@
       <w:color w:val="0F4761" w:themeColor="accent1" w:themeShade="BF"/>
     </w:rPr>
   </w:style>
-  <w:style w:type="paragraph" w:styleId="ab">
+  <w:style w:type="paragraph" w:styleId="IntenseQuote">
     <w:name w:val="Intense Quote"/>
-    <w:basedOn w:val="a"/>
-    <w:next w:val="a"/>
-    <w:link w:val="ac"/>
+    <w:basedOn w:val="Normal"/>
+    <w:next w:val="Normal"/>
+    <w:link w:val="IntenseQuoteChar"/>
     <w:uiPriority w:val="30"/>
     <w:qFormat/>
     <w:rsid w:val="00FD6400"/>
@@ -18763,10 +19008,10 @@
       <w:color w:val="0F4761" w:themeColor="accent1" w:themeShade="BF"/>
     </w:rPr>
   </w:style>
-  <w:style w:type="character" w:customStyle="1" w:styleId="ac">
-    <w:name w:val="Насичена цитата Знак"/>
-    <w:basedOn w:val="a0"/>
-    <w:link w:val="ab"/>
+  <w:style w:type="character" w:customStyle="1" w:styleId="IntenseQuoteChar">
+    <w:name w:val="Intense Quote Char"/>
+    <w:basedOn w:val="DefaultParagraphFont"/>
+    <w:link w:val="IntenseQuote"/>
     <w:uiPriority w:val="30"/>
     <w:rsid w:val="00FD6400"/>
     <w:rPr>
@@ -18775,9 +19020,9 @@
       <w:color w:val="0F4761" w:themeColor="accent1" w:themeShade="BF"/>
     </w:rPr>
   </w:style>
-  <w:style w:type="character" w:styleId="ad">
+  <w:style w:type="character" w:styleId="IntenseReference">
     <w:name w:val="Intense Reference"/>
-    <w:basedOn w:val="a0"/>
+    <w:basedOn w:val="DefaultParagraphFont"/>
     <w:uiPriority w:val="32"/>
     <w:qFormat/>
     <w:rsid w:val="00FD6400"/>
@@ -18789,10 +19034,10 @@
       <w:spacing w:val="5"/>
     </w:rPr>
   </w:style>
-  <w:style w:type="paragraph" w:styleId="ae">
+  <w:style w:type="paragraph" w:styleId="Header">
     <w:name w:val="header"/>
-    <w:basedOn w:val="a"/>
-    <w:link w:val="af"/>
+    <w:basedOn w:val="Normal"/>
+    <w:link w:val="HeaderChar"/>
     <w:uiPriority w:val="99"/>
     <w:unhideWhenUsed/>
     <w:rsid w:val="00DD65AC"/>
@@ -18804,17 +19049,17 @@
       <w:spacing w:after="0" w:line="240" w:lineRule="auto"/>
     </w:pPr>
   </w:style>
-  <w:style w:type="character" w:customStyle="1" w:styleId="af">
-    <w:name w:val="Верхній колонтитул Знак"/>
-    <w:basedOn w:val="a0"/>
-    <w:link w:val="ae"/>
+  <w:style w:type="character" w:customStyle="1" w:styleId="HeaderChar">
+    <w:name w:val="Header Char"/>
+    <w:basedOn w:val="DefaultParagraphFont"/>
+    <w:link w:val="Header"/>
     <w:uiPriority w:val="99"/>
     <w:rsid w:val="00DD65AC"/>
   </w:style>
-  <w:style w:type="paragraph" w:styleId="af0">
+  <w:style w:type="paragraph" w:styleId="Footer">
     <w:name w:val="footer"/>
-    <w:basedOn w:val="a"/>
-    <w:link w:val="af1"/>
+    <w:basedOn w:val="Normal"/>
+    <w:link w:val="FooterChar"/>
     <w:uiPriority w:val="99"/>
     <w:unhideWhenUsed/>
     <w:rsid w:val="00DD65AC"/>
@@ -18826,17 +19071,17 @@
       <w:spacing w:after="0" w:line="240" w:lineRule="auto"/>
     </w:pPr>
   </w:style>
-  <w:style w:type="character" w:customStyle="1" w:styleId="af1">
-    <w:name w:val="Нижній колонтитул Знак"/>
-    <w:basedOn w:val="a0"/>
-    <w:link w:val="af0"/>
+  <w:style w:type="character" w:customStyle="1" w:styleId="FooterChar">
+    <w:name w:val="Footer Char"/>
+    <w:basedOn w:val="DefaultParagraphFont"/>
+    <w:link w:val="Footer"/>
     <w:uiPriority w:val="99"/>
     <w:rsid w:val="00DD65AC"/>
   </w:style>
-  <w:style w:type="paragraph" w:styleId="HTML">
+  <w:style w:type="paragraph" w:styleId="HTMLPreformatted">
     <w:name w:val="HTML Preformatted"/>
-    <w:basedOn w:val="a"/>
-    <w:link w:val="HTML0"/>
+    <w:basedOn w:val="Normal"/>
+    <w:link w:val="HTMLPreformattedChar"/>
     <w:uiPriority w:val="99"/>
     <w:semiHidden/>
     <w:unhideWhenUsed/>
@@ -18850,10 +19095,10 @@
       <w:szCs w:val="20"/>
     </w:rPr>
   </w:style>
-  <w:style w:type="character" w:customStyle="1" w:styleId="HTML0">
-    <w:name w:val="Стандартний HTML Знак"/>
-    <w:basedOn w:val="a0"/>
-    <w:link w:val="HTML"/>
+  <w:style w:type="character" w:customStyle="1" w:styleId="HTMLPreformattedChar">
+    <w:name w:val="HTML Preformatted Char"/>
+    <w:basedOn w:val="DefaultParagraphFont"/>
+    <w:link w:val="HTMLPreformatted"/>
     <w:uiPriority w:val="99"/>
     <w:semiHidden/>
     <w:rsid w:val="00811EC9"/>
@@ -18863,9 +19108,9 @@
       <w:szCs w:val="20"/>
     </w:rPr>
   </w:style>
-  <w:style w:type="character" w:styleId="af2">
+  <w:style w:type="character" w:styleId="Hyperlink">
     <w:name w:val="Hyperlink"/>
-    <w:basedOn w:val="a0"/>
+    <w:basedOn w:val="DefaultParagraphFont"/>
     <w:uiPriority w:val="99"/>
     <w:unhideWhenUsed/>
     <w:rsid w:val="0057451C"/>
@@ -18874,9 +19119,9 @@
       <w:u w:val="single"/>
     </w:rPr>
   </w:style>
-  <w:style w:type="character" w:styleId="af3">
+  <w:style w:type="character" w:styleId="UnresolvedMention">
     <w:name w:val="Unresolved Mention"/>
-    <w:basedOn w:val="a0"/>
+    <w:basedOn w:val="DefaultParagraphFont"/>
     <w:uiPriority w:val="99"/>
     <w:semiHidden/>
     <w:unhideWhenUsed/>

</xml_diff>